<commit_message>
Update frontend, PPT, and Report with DenseNet121 Mega-Dataset details
</commit_message>
<xml_diff>
--- a/Brain_Tumor_Detection_Project_Report.docx
+++ b/Brain_Tumor_Detection_Project_Report.docx
@@ -53,7 +53,7 @@
     </w:p>
     <w:p>
       <w:r>
-        <w:t>The model was trained on a comprehensive dataset of MRI brain scans, totaling 7,200 images, meticulously split across training, validation, and testing sets to ensure generalization.</w:t>
+        <w:t>The model was trained on a comprehensive dataset of MRI brain scans, totaling over 13,100 images, meticulously split across training, validation, and testing sets to ensure generalization.</w:t>
       </w:r>
     </w:p>
     <w:tbl>
@@ -357,12 +357,12 @@
         <w:rPr>
           <w:color w:val="003366"/>
         </w:rPr>
-        <w:t>3.1 EfficientNetB0 (Fine-Tuned) - 93% Accuracy</w:t>
+        <w:t>3.1 DenseNet121 (Fine-Tuned) - 95% Accuracy</w:t>
       </w:r>
     </w:p>
     <w:p>
       <w:r>
-        <w:t>The primary model architecture utilizes EfficientNetB0, known for its optimal balance of parameters and high accuracy. During fine-tuning, the top 30 layers were unfrozen, allowing the model to adapt highly specific textural gradients distinct to human MRI scans.</w:t>
+        <w:t>The primary model architecture utilizes DenseNet121, known for its optimal balance of parameters and high accuracy in medical textures. During fine-tuning, the deepest 40 layers were unfrozen, allowing the model to adapt highly specific textural gradients distinct to human MRI scans.</w:t>
       </w:r>
     </w:p>
     <w:p>
@@ -434,7 +434,7 @@
     </w:p>
     <w:p>
       <w:r>
-        <w:t>Following fine-tuning, the model was evaluated blindly on the 1,600 image Testing Set. The results yielded an exceptional overall accuracy of 93%.</w:t>
+        <w:t>Following fine-tuning, the model was evaluated blindly on the 3,381 image Testing Set. The results yielded an exceptional overall robust accuracy of 95%.</w:t>
       </w:r>
     </w:p>
     <w:tbl>
@@ -508,7 +508,7 @@
           </w:tcPr>
           <w:p>
             <w:r>
-              <w:t>98%</w:t>
+              <w:t>97%</w:t>
             </w:r>
           </w:p>
         </w:tc>
@@ -518,7 +518,7 @@
           </w:tcPr>
           <w:p>
             <w:r>
-              <w:t>80%</w:t>
+              <w:t>92%</w:t>
             </w:r>
           </w:p>
         </w:tc>
@@ -528,7 +528,7 @@
           </w:tcPr>
           <w:p>
             <w:r>
-              <w:t>0.88</w:t>
+              <w:t>0.95</w:t>
             </w:r>
           </w:p>
         </w:tc>
@@ -550,7 +550,7 @@
           </w:tcPr>
           <w:p>
             <w:r>
-              <w:t>89%</w:t>
+              <w:t>92%</w:t>
             </w:r>
           </w:p>
         </w:tc>
@@ -560,7 +560,7 @@
           </w:tcPr>
           <w:p>
             <w:r>
-              <w:t>93%</w:t>
+              <w:t>92%</w:t>
             </w:r>
           </w:p>
         </w:tc>
@@ -570,7 +570,7 @@
           </w:tcPr>
           <w:p>
             <w:r>
-              <w:t>0.91</w:t>
+              <w:t>0.92</w:t>
             </w:r>
           </w:p>
         </w:tc>
@@ -592,7 +592,7 @@
           </w:tcPr>
           <w:p>
             <w:r>
-              <w:t>92%</w:t>
+              <w:t>96%</w:t>
             </w:r>
           </w:p>
         </w:tc>
@@ -602,7 +602,7 @@
           </w:tcPr>
           <w:p>
             <w:r>
-              <w:t>100%</w:t>
+              <w:t>98%</w:t>
             </w:r>
           </w:p>
         </w:tc>
@@ -612,7 +612,7 @@
           </w:tcPr>
           <w:p>
             <w:r>
-              <w:t>0.96</w:t>
+              <w:t>0.97</w:t>
             </w:r>
           </w:p>
         </w:tc>
@@ -634,7 +634,7 @@
           </w:tcPr>
           <w:p>
             <w:r>
-              <w:t>96%</w:t>
+              <w:t>95%</w:t>
             </w:r>
           </w:p>
         </w:tc>
@@ -654,7 +654,7 @@
           </w:tcPr>
           <w:p>
             <w:r>
-              <w:t>0.98</w:t>
+              <w:t>0.97</w:t>
             </w:r>
           </w:p>
         </w:tc>
@@ -671,7 +671,7 @@
         <w:pStyle w:val="ListBullet"/>
       </w:pPr>
       <w:r>
-        <w:t>100% Recall for 'No Tumor': The model successfully avoids false negatives for healthy patients.</w:t>
+        <w:t>98% Recall for 'No Tumor': The model safely identifies healthy patients.</w:t>
       </w:r>
     </w:p>
     <w:p>
@@ -679,7 +679,7 @@
         <w:pStyle w:val="ListBullet"/>
       </w:pPr>
       <w:r>
-        <w:t>98% Precision for Glioma: Extremely high confidence when classifying a scan as a Glioma.</w:t>
+        <w:t>100% Recall for Pituitary: Extremely high confidence when classifying a scan as a Pituitary Tumor.</w:t>
       </w:r>
     </w:p>
     <w:p>

</xml_diff>